<commit_message>
Apply native-speaker language edits, drop language-editor acknowledgement, force Times New Roman
Co-Authored-By: Claude Opus 5.5 <noreply@anthropic.com>
Claude-Session: https://claude.ai/code/session_01Ny4MKFPCnQG8RbtvfHQ86Z
</commit_message>
<xml_diff>
--- a/SAJE_292892_revision/build_r6/01_Title_Page.docx
+++ b/SAJE_292892_revision/build_r6/01_Title_Page.docx
@@ -255,7 +255,7 @@
         <w:t xml:space="preserve"> </w:t>
       </w:r>
       <w:r>
-        <w:t xml:space="preserve">and an anonymous referee for comments and suggestions that substantially improved this paper. An earlier version of the manuscript was edited for language by a native English-speaking editor.</w:t>
+        <w:t xml:space="preserve">and an anonymous referee for comments and suggestions that substantially improved this paper.</w:t>
       </w:r>
     </w:p>
   </w:footnote>
@@ -351,7 +351,7 @@
   <w:docDefaults>
     <w:rPrDefault>
       <w:rPr>
-        <w:rFonts w:asciiTheme="minorHAnsi" w:cstheme="minorBidi" w:eastAsiaTheme="minorHAnsi" w:hAnsiTheme="minorHAnsi"/>
+        <w:rFonts w:ascii="Times New Roman" w:hAnsi="Times New Roman" w:eastAsia="Times New Roman" w:cs="Times New Roman"/>
         <w:sz w:val="24"/>
         <w:szCs w:val="24"/>
         <w:lang w:bidi="ar-SA" w:eastAsia="en-US" w:val="en-US"/>
@@ -1179,7 +1179,7 @@
     </a:clrScheme>
     <a:fontScheme name="Office">
       <a:majorFont>
-        <a:latin typeface="Calibri"/>
+        <a:latin typeface="Times New Roman"/>
         <a:ea typeface=""/>
         <a:cs typeface=""/>
         <a:font script="Jpan" typeface="ＭＳ ゴシック"/>
@@ -1213,7 +1213,7 @@
         <a:font script="Uigh" typeface="Microsoft Uighur"/>
       </a:majorFont>
       <a:minorFont>
-        <a:latin typeface="Cambria"/>
+        <a:latin typeface="Times New Roman"/>
         <a:ea typeface=""/>
         <a:cs typeface=""/>
         <a:font script="Jpan" typeface="ＭＳ 明朝"/>

</xml_diff>